<commit_message>
Clase 4: explicar JUnit desde cero en guía, presentación y README
La clase 1 ya no usa JUnit y las clases 2 y 3 usan Cucumber, así que en
la clase 4 se presenta JUnit por primera vez: @Test, @DisplayName y
assertEquals(esperado, real) antes de usarlos.

Co-Authored-By: Claude Opus 5 (1M context) <noreply@anthropic.com>
Claude-Session: https://claude.ai/code/session_01L2JuF1iG72koPJkmuRWSzm
</commit_message>
<xml_diff>
--- a/material-de-apoyo/Clase4_Guia_Estudio_Playwright_POM.docx
+++ b/material-de-apoyo/Clase4_Guia_Estudio_Playwright_POM.docx
@@ -2409,6 +2409,259 @@
           <w:sz w:val="36"/>
         </w:rPr>
         <w:t>4. Las pruebas</w:t>
+      </w:r>
+    </w:p>
+    <w:p>
+      <w:pPr>
+        <w:keepNext/>
+        <w:spacing w:before="200" w:after="80"/>
+      </w:pPr>
+      <w:r>
+        <w:rPr>
+          <w:b/>
+          <w:color w:val="0072BC"/>
+          <w:sz w:val="28"/>
+        </w:rPr>
+        <w:t>JUnit: cómo se escribe una prueba</w:t>
+      </w:r>
+    </w:p>
+    <w:p>
+      <w:r>
+        <w:rPr>
+          <w:b w:val="0"/>
+        </w:rPr>
+        <w:t xml:space="preserve">Hasta ahora escribiste programas en Java puro (clase 1) y pruebas con Cucumber y Serenity (clases 2 y 3). Hoy escribimos las pruebas a mano con JUnit, la librería de pruebas más usada en Java. Una prueba de JUnit es un método normal con unas marcas encima, que se llaman anotaciones y empiezan con </w:t>
+      </w:r>
+      <w:r>
+        <w:rPr>
+          <w:rFonts w:ascii="Consolas" w:hAnsi="Consolas" w:eastAsia="Consolas"/>
+          <w:color w:val="003D7A"/>
+        </w:rPr>
+        <w:t>@</w:t>
+      </w:r>
+      <w:r>
+        <w:rPr>
+          <w:b w:val="0"/>
+        </w:rPr>
+        <w:t>.</w:t>
+      </w:r>
+    </w:p>
+    <w:tbl>
+      <w:tblPr>
+        <w:tblW w:type="auto" w:w="0"/>
+        <w:jc w:val="center"/>
+        <w:tblLook w:firstColumn="1" w:firstRow="1" w:lastColumn="0" w:lastRow="0" w:noHBand="0" w:noVBand="1" w:val="04A0"/>
+      </w:tblPr>
+      <w:tblGrid>
+        <w:gridCol w:w="9632"/>
+      </w:tblGrid>
+      <w:tr>
+        <w:trPr>
+          <w:cantSplit/>
+        </w:trPr>
+        <w:tc>
+          <w:tcPr>
+            <w:tcW w:type="dxa" w:w="9632"/>
+            <w:shd w:val="clear" w:color="auto" w:fill="F2F5F9"/>
+            <w:tcBorders>
+              <w:top w:val="nil"/>
+              <w:left w:val="single" w:sz="18" w:color="0072BC"/>
+              <w:bottom w:val="nil"/>
+              <w:right w:val="nil"/>
+            </w:tcBorders>
+          </w:tcPr>
+          <w:p>
+            <w:r/>
+            <w:r>
+              <w:rPr>
+                <w:b/>
+                <w:color w:val="52606D"/>
+                <w:sz w:val="18"/>
+              </w:rPr>
+              <w:t>Ejemplo mínimo de JUnit</w:t>
+            </w:r>
+          </w:p>
+          <w:p>
+            <w:pPr>
+              <w:keepNext/>
+              <w:spacing w:after="0" w:line="240" w:lineRule="auto"/>
+            </w:pPr>
+            <w:r>
+              <w:rPr>
+                <w:rFonts w:ascii="Consolas" w:hAnsi="Consolas" w:eastAsia="Consolas"/>
+                <w:color w:val="1F2933"/>
+                <w:sz w:val="19"/>
+              </w:rPr>
+              <w:t>@Test</w:t>
+            </w:r>
+          </w:p>
+          <w:p>
+            <w:pPr>
+              <w:keepNext/>
+              <w:spacing w:after="0" w:line="240" w:lineRule="auto"/>
+            </w:pPr>
+            <w:r>
+              <w:rPr>
+                <w:rFonts w:ascii="Consolas" w:hAnsi="Consolas" w:eastAsia="Consolas"/>
+                <w:color w:val="1F2933"/>
+                <w:sz w:val="19"/>
+              </w:rPr>
+              <w:t>@DisplayName("Dos más dos da cuatro")</w:t>
+            </w:r>
+          </w:p>
+          <w:p>
+            <w:pPr>
+              <w:keepNext/>
+              <w:spacing w:after="0" w:line="240" w:lineRule="auto"/>
+            </w:pPr>
+            <w:r>
+              <w:rPr>
+                <w:rFonts w:ascii="Consolas" w:hAnsi="Consolas" w:eastAsia="Consolas"/>
+                <w:color w:val="1F2933"/>
+                <w:sz w:val="19"/>
+              </w:rPr>
+              <w:t>void sumaSencilla() {</w:t>
+            </w:r>
+          </w:p>
+          <w:p>
+            <w:pPr>
+              <w:keepNext/>
+              <w:spacing w:after="0" w:line="240" w:lineRule="auto"/>
+            </w:pPr>
+            <w:r>
+              <w:rPr>
+                <w:rFonts w:ascii="Consolas" w:hAnsi="Consolas" w:eastAsia="Consolas"/>
+                <w:color w:val="1F2933"/>
+                <w:sz w:val="19"/>
+              </w:rPr>
+              <w:t xml:space="preserve">    int resultado = 2 + 2;</w:t>
+            </w:r>
+          </w:p>
+          <w:p>
+            <w:pPr>
+              <w:keepNext/>
+              <w:spacing w:after="0" w:line="240" w:lineRule="auto"/>
+            </w:pPr>
+            <w:r>
+              <w:rPr>
+                <w:rFonts w:ascii="Consolas" w:hAnsi="Consolas" w:eastAsia="Consolas"/>
+                <w:color w:val="1F2933"/>
+                <w:sz w:val="19"/>
+              </w:rPr>
+              <w:t xml:space="preserve">    assertEquals(4, resultado);</w:t>
+            </w:r>
+          </w:p>
+          <w:p>
+            <w:pPr>
+              <w:keepNext/>
+              <w:spacing w:after="0" w:line="240" w:lineRule="auto"/>
+            </w:pPr>
+            <w:r>
+              <w:rPr>
+                <w:rFonts w:ascii="Consolas" w:hAnsi="Consolas" w:eastAsia="Consolas"/>
+                <w:color w:val="1F2933"/>
+                <w:sz w:val="19"/>
+              </w:rPr>
+              <w:t>}</w:t>
+            </w:r>
+          </w:p>
+        </w:tc>
+      </w:tr>
+    </w:tbl>
+    <w:p>
+      <w:pPr>
+        <w:spacing w:after="40"/>
+      </w:pPr>
+    </w:p>
+    <w:p>
+      <w:pPr>
+        <w:pStyle w:val="ListBullet"/>
+        <w:spacing w:after="60"/>
+      </w:pPr>
+      <w:r>
+        <w:rPr>
+          <w:rFonts w:ascii="Consolas" w:hAnsi="Consolas" w:eastAsia="Consolas"/>
+          <w:color w:val="003D7A"/>
+        </w:rPr>
+        <w:t>@Test</w:t>
+      </w:r>
+      <w:r>
+        <w:rPr>
+          <w:b w:val="0"/>
+        </w:rPr>
+        <w:t xml:space="preserve"> le dice a JUnit que ese método es una prueba. Sin esa marca, </w:t>
+      </w:r>
+      <w:r>
+        <w:rPr>
+          <w:rFonts w:ascii="Consolas" w:hAnsi="Consolas" w:eastAsia="Consolas"/>
+          <w:color w:val="003D7A"/>
+        </w:rPr>
+        <w:t>gradle test</w:t>
+      </w:r>
+      <w:r>
+        <w:rPr>
+          <w:b w:val="0"/>
+        </w:rPr>
+        <w:t xml:space="preserve"> no lo corre.</w:t>
+      </w:r>
+    </w:p>
+    <w:p>
+      <w:pPr>
+        <w:pStyle w:val="ListBullet"/>
+        <w:spacing w:after="60"/>
+      </w:pPr>
+      <w:r>
+        <w:rPr>
+          <w:rFonts w:ascii="Consolas" w:hAnsi="Consolas" w:eastAsia="Consolas"/>
+          <w:color w:val="003D7A"/>
+        </w:rPr>
+        <w:t>@DisplayName("...")</w:t>
+      </w:r>
+      <w:r>
+        <w:rPr>
+          <w:b w:val="0"/>
+        </w:rPr>
+        <w:t xml:space="preserve"> es el nombre que ves en la consola cuando corre la prueba. Es opcional, pero se lee mejor.</w:t>
+      </w:r>
+    </w:p>
+    <w:p>
+      <w:pPr>
+        <w:pStyle w:val="ListBullet"/>
+        <w:spacing w:after="60"/>
+      </w:pPr>
+      <w:r>
+        <w:rPr>
+          <w:rFonts w:ascii="Consolas" w:hAnsi="Consolas" w:eastAsia="Consolas"/>
+          <w:color w:val="003D7A"/>
+        </w:rPr>
+        <w:t>assertEquals(esperado, real)</w:t>
+      </w:r>
+      <w:r>
+        <w:rPr>
+          <w:b w:val="0"/>
+        </w:rPr>
+        <w:t xml:space="preserve"> compara dos valores. Si son iguales la prueba sigue y termina en PASSED. Si no, la prueba se detiene, sale FAILED y te muestra </w:t>
+      </w:r>
+      <w:r>
+        <w:rPr>
+          <w:rFonts w:ascii="Consolas" w:hAnsi="Consolas" w:eastAsia="Consolas"/>
+          <w:color w:val="003D7A"/>
+        </w:rPr>
+        <w:t>expected: &lt;esperado&gt; but was: &lt;real&gt;</w:t>
+      </w:r>
+      <w:r>
+        <w:rPr>
+          <w:b w:val="0"/>
+        </w:rPr>
+        <w:t>.</w:t>
+      </w:r>
+    </w:p>
+    <w:p>
+      <w:r>
+        <w:rPr>
+          <w:b w:val="0"/>
+        </w:rPr>
+        <w:t>El orden importa: primero lo que tú esperas y después lo que salió de verdad. Si los inviertes la prueba funciona igual, pero el mensaje de error te confunde.</w:t>
       </w:r>
     </w:p>
     <w:p>
@@ -5167,57 +5420,13 @@
         <w:spacing w:after="40"/>
       </w:pPr>
     </w:p>
-    <w:tbl>
-      <w:tblPr>
-        <w:tblW w:type="auto" w:w="0"/>
-        <w:tblLook w:firstColumn="1" w:firstRow="1" w:lastColumn="0" w:lastRow="0" w:noHBand="0" w:noVBand="1" w:val="04A0"/>
-      </w:tblPr>
-      <w:tblGrid>
-        <w:gridCol w:w="9632"/>
-      </w:tblGrid>
-      <w:tr>
-        <w:trPr>
-          <w:cantSplit/>
-        </w:trPr>
-        <w:tc>
-          <w:tcPr>
-            <w:tcW w:type="dxa" w:w="9632"/>
-            <w:shd w:val="clear" w:color="auto" w:fill="FFF4DB"/>
-            <w:tcBorders>
-              <w:top w:val="nil"/>
-              <w:left w:val="single" w:sz="24" w:color="8A5A00"/>
-              <w:bottom w:val="nil"/>
-              <w:right w:val="nil"/>
-            </w:tcBorders>
-          </w:tcPr>
-          <w:p>
-            <w:pPr>
-              <w:spacing w:after="40"/>
-            </w:pPr>
-            <w:r>
-              <w:rPr>
-                <w:b/>
-                <w:color w:val="8A5A00"/>
-                <w:sz w:val="22"/>
-              </w:rPr>
-              <w:t>Ojo</w:t>
-            </w:r>
-          </w:p>
-          <w:p>
-            <w:r>
-              <w:rPr>
-                <w:b w:val="0"/>
-              </w:rPr>
-              <w:t>El error de strict mode no es un capricho. Si Playwright encuentra tres campos y tú le dices escribe aquí, no sabe en cuál. Prefiere avisarte a adivinar.</w:t>
-            </w:r>
-          </w:p>
-        </w:tc>
-      </w:tr>
-    </w:tbl>
     <w:p>
-      <w:pPr>
-        <w:spacing w:after="40"/>
-      </w:pPr>
+      <w:r>
+        <w:rPr>
+          <w:b w:val="0"/>
+        </w:rPr>
+        <w:t>El error de strict mode no es un capricho. Si Playwright encuentra tres campos y tú le dices escribe aquí, no sabe en cuál. Prefiere avisarte a adivinar.</w:t>
+      </w:r>
     </w:p>
     <w:p>
       <w:pPr>
@@ -5263,6 +5472,9 @@
             </w:tcBorders>
           </w:tcPr>
           <w:p>
+            <w:pPr>
+              <w:keepNext/>
+            </w:pPr>
             <w:r>
               <w:rPr>
                 <w:b/>
@@ -5285,6 +5497,9 @@
             </w:tcBorders>
           </w:tcPr>
           <w:p>
+            <w:pPr>
+              <w:keepNext/>
+            </w:pPr>
             <w:r>
               <w:rPr>
                 <w:b/>
@@ -5311,6 +5526,9 @@
             </w:tcBorders>
           </w:tcPr>
           <w:p>
+            <w:pPr>
+              <w:keepNext/>
+            </w:pPr>
             <w:r>
               <w:rPr>
                 <w:b w:val="0"/>
@@ -5331,6 +5549,9 @@
             </w:tcBorders>
           </w:tcPr>
           <w:p>
+            <w:pPr>
+              <w:keepNext/>
+            </w:pPr>
             <w:r>
               <w:rPr>
                 <w:b w:val="0"/>
@@ -5357,6 +5578,9 @@
             </w:tcBorders>
           </w:tcPr>
           <w:p>
+            <w:pPr>
+              <w:keepNext/>
+            </w:pPr>
             <w:r>
               <w:rPr>
                 <w:b w:val="0"/>
@@ -5378,6 +5602,9 @@
             </w:tcBorders>
           </w:tcPr>
           <w:p>
+            <w:pPr>
+              <w:keepNext/>
+            </w:pPr>
             <w:r>
               <w:rPr>
                 <w:b w:val="0"/>
@@ -5403,6 +5630,9 @@
             </w:tcBorders>
           </w:tcPr>
           <w:p>
+            <w:pPr>
+              <w:keepNext/>
+            </w:pPr>
             <w:r>
               <w:rPr>
                 <w:b w:val="0"/>
@@ -5423,6 +5653,9 @@
             </w:tcBorders>
           </w:tcPr>
           <w:p>
+            <w:pPr>
+              <w:keepNext/>
+            </w:pPr>
             <w:r>
               <w:rPr>
                 <w:b w:val="0"/>
@@ -5449,6 +5682,9 @@
             </w:tcBorders>
           </w:tcPr>
           <w:p>
+            <w:pPr>
+              <w:keepNext/>
+            </w:pPr>
             <w:r>
               <w:rPr>
                 <w:b w:val="0"/>
@@ -5470,6 +5706,9 @@
             </w:tcBorders>
           </w:tcPr>
           <w:p>
+            <w:pPr>
+              <w:keepNext/>
+            </w:pPr>
             <w:r>
               <w:rPr>
                 <w:b w:val="0"/>
@@ -5495,6 +5734,9 @@
             </w:tcBorders>
           </w:tcPr>
           <w:p>
+            <w:pPr>
+              <w:keepNext/>
+            </w:pPr>
             <w:r>
               <w:rPr>
                 <w:b w:val="0"/>
@@ -5515,6 +5757,9 @@
             </w:tcBorders>
           </w:tcPr>
           <w:p>
+            <w:pPr>
+              <w:keepNext/>
+            </w:pPr>
             <w:r>
               <w:rPr>
                 <w:b w:val="0"/>
@@ -5541,6 +5786,9 @@
             </w:tcBorders>
           </w:tcPr>
           <w:p>
+            <w:pPr>
+              <w:keepNext/>
+            </w:pPr>
             <w:r>
               <w:rPr>
                 <w:b w:val="0"/>
@@ -5562,6 +5810,9 @@
             </w:tcBorders>
           </w:tcPr>
           <w:p>
+            <w:pPr>
+              <w:keepNext/>
+            </w:pPr>
             <w:r>
               <w:rPr>
                 <w:b w:val="0"/>
@@ -5587,6 +5838,9 @@
             </w:tcBorders>
           </w:tcPr>
           <w:p>
+            <w:pPr>
+              <w:keepNext/>
+            </w:pPr>
             <w:r>
               <w:rPr>
                 <w:b w:val="0"/>
@@ -5607,6 +5861,9 @@
             </w:tcBorders>
           </w:tcPr>
           <w:p>
+            <w:pPr>
+              <w:keepNext/>
+            </w:pPr>
             <w:r>
               <w:rPr>
                 <w:b w:val="0"/>
@@ -5633,6 +5890,58 @@
             </w:tcBorders>
           </w:tcPr>
           <w:p>
+            <w:pPr>
+              <w:keepNext/>
+            </w:pPr>
+            <w:r>
+              <w:rPr>
+                <w:b w:val="0"/>
+                <w:sz w:val="20"/>
+              </w:rPr>
+              <w:t>JUnit</w:t>
+            </w:r>
+          </w:p>
+        </w:tc>
+        <w:tc>
+          <w:tcPr>
+            <w:tcW w:type="dxa" w:w="6803"/>
+            <w:shd w:val="clear" w:color="auto" w:fill="F2F5F9"/>
+            <w:tcBorders>
+              <w:top w:val="single" w:sz="6" w:color="D0D7DE"/>
+              <w:left w:val="single" w:sz="6" w:color="D0D7DE"/>
+              <w:bottom w:val="single" w:sz="6" w:color="D0D7DE"/>
+              <w:right w:val="single" w:sz="6" w:color="D0D7DE"/>
+            </w:tcBorders>
+          </w:tcPr>
+          <w:p>
+            <w:pPr>
+              <w:keepNext/>
+            </w:pPr>
+            <w:r>
+              <w:rPr>
+                <w:b w:val="0"/>
+                <w:sz w:val="20"/>
+              </w:rPr>
+              <w:t>Librería de Java para escribir pruebas con @Test y compararlas con assertEquals.</w:t>
+            </w:r>
+          </w:p>
+        </w:tc>
+      </w:tr>
+      <w:tr>
+        <w:trPr>
+          <w:cantSplit/>
+        </w:trPr>
+        <w:tc>
+          <w:tcPr>
+            <w:tcW w:type="dxa" w:w="2835"/>
+            <w:tcBorders>
+              <w:top w:val="single" w:sz="6" w:color="D0D7DE"/>
+              <w:left w:val="single" w:sz="6" w:color="D0D7DE"/>
+              <w:bottom w:val="single" w:sz="6" w:color="D0D7DE"/>
+              <w:right w:val="single" w:sz="6" w:color="D0D7DE"/>
+            </w:tcBorders>
+          </w:tcPr>
+          <w:p>
             <w:r>
               <w:rPr>
                 <w:b w:val="0"/>
@@ -5645,7 +5954,6 @@
         <w:tc>
           <w:tcPr>
             <w:tcW w:type="dxa" w:w="6803"/>
-            <w:shd w:val="clear" w:color="auto" w:fill="F2F5F9"/>
             <w:tcBorders>
               <w:top w:val="single" w:sz="6" w:color="D0D7DE"/>
               <w:left w:val="single" w:sz="6" w:color="D0D7DE"/>
@@ -5885,6 +6193,20 @@
         <w:rPr>
           <w:b w:val="0"/>
         </w:rPr>
+        <w:t xml:space="preserve"> ¿Qué pasa si en assertEquals("Products", productos.titulo()) el título no es Products?</w:t>
+      </w:r>
+    </w:p>
+    <w:p>
+      <w:r>
+        <w:rPr>
+          <w:b/>
+        </w:rPr>
+        <w:t>7.</w:t>
+      </w:r>
+      <w:r>
+        <w:rPr>
+          <w:b w:val="0"/>
+        </w:rPr>
         <w:t xml:space="preserve"> En POM, ¿quién tiene los métodos que hacen las acciones? ¿Y en Screenplay?</w:t>
       </w:r>
     </w:p>
@@ -5978,6 +6300,20 @@
           <w:b/>
         </w:rPr>
         <w:t>6.</w:t>
+      </w:r>
+      <w:r>
+        <w:rPr>
+          <w:b w:val="0"/>
+        </w:rPr>
+        <w:t xml:space="preserve"> La prueba falla (FAILED) y la consola muestra expected: &lt;Products&gt; but was: &lt;el texto que salió&gt;.</w:t>
+      </w:r>
+    </w:p>
+    <w:p>
+      <w:r>
+        <w:rPr>
+          <w:b/>
+        </w:rPr>
+        <w:t>7.</w:t>
       </w:r>
       <w:r>
         <w:rPr>

</xml_diff>

<commit_message>
Clase 4: usar los nombres reales de la rama 02 al comparar con Screenplay
Co-Authored-By: Claude Opus 5 (1M context) <noreply@anthropic.com>
Claude-Session: https://claude.ai/code/session_01L2JuF1iG72koPJkmuRWSzm
</commit_message>
<xml_diff>
--- a/material-de-apoyo/Clase4_Guia_Estudio_Playwright_POM.docx
+++ b/material-de-apoyo/Clase4_Guia_Estudio_Playwright_POM.docx
@@ -4557,7 +4557,7 @@
                 <w:b w:val="0"/>
                 <w:sz w:val="20"/>
               </w:rPr>
-              <w:t>Un actor que ejecuta tareas (Task)</w:t>
+              <w:t>Un actor que ejecuta tareas (tasks/IniciarSesion)</w:t>
             </w:r>
           </w:p>
         </w:tc>
@@ -4633,7 +4633,7 @@
                 <w:b w:val="0"/>
                 <w:sz w:val="20"/>
               </w:rPr>
-              <w:t>En las clases de userinterfaces</w:t>
+              <w:t>En userinterfaces/PaginaLogin</w:t>
             </w:r>
           </w:p>
         </w:tc>
@@ -4708,7 +4708,7 @@
                 <w:b w:val="0"/>
                 <w:sz w:val="20"/>
               </w:rPr>
-              <w:t>Con preguntas (Question)</w:t>
+              <w:t>Con preguntas (questions/MensajeDeError)</w:t>
             </w:r>
           </w:p>
         </w:tc>

</xml_diff>